<commit_message>
Updated content and metadata across multiple languages with extensive JSON and docx revisions for 2026-03-26 release.
</commit_message>
<xml_diff>
--- a/eng/docx/011.content.docx
+++ b/eng/docx/011.content.docx
@@ -955,7 +955,20 @@
         <w:rPr>
           <w:lang w:val="en_US" w:bidi="en_US"/>
         </w:rPr>
-        <w:t xml:space="preserve">The name "Kadmonites" means "eastern" in Hebrew. This may be why the Bible sometimes talks about the "people of the east" (for example, in </w:t>
+        <w:t xml:space="preserve">The name </w:t>
+      </w:r>
+      <w:r>
+        <w:rPr>
+          <w:i/>
+          <w:lang w:val="en_US" w:bidi="en_US"/>
+        </w:rPr>
+        <w:t>Kadmonites</w:t>
+      </w:r>
+      <w:r>
+        <w:rPr>
+          <w:lang w:val="en_US" w:bidi="en_US"/>
+        </w:rPr>
+        <w:t xml:space="preserve"> means "eastern" in Hebrew. This may be why the Bible sometimes talks about the "people of the east" (for example, in </w:t>
       </w:r>
       <w:hyperlink r:id="rId36">
         <w:r>
@@ -1195,7 +1208,20 @@
         <w:rPr>
           <w:lang w:val="en_US" w:bidi="en_US"/>
         </w:rPr>
-        <w:t>). The name "Kain" in Hebrew means "spear," which suggests they may have been skilled in making metal tools and weapons. The tribe lived as nomads, moving from place to place rather than settling in one area. They were friendly toward Israel (</w:t>
+        <w:t xml:space="preserve">). The name </w:t>
+      </w:r>
+      <w:r>
+        <w:rPr>
+          <w:i/>
+          <w:lang w:val="en_US" w:bidi="en_US"/>
+        </w:rPr>
+        <w:t>Kain</w:t>
+      </w:r>
+      <w:r>
+        <w:rPr>
+          <w:lang w:val="en_US" w:bidi="en_US"/>
+        </w:rPr>
+        <w:t xml:space="preserve"> in Hebrew means "spear," which suggests they may have been skilled in making metal tools and weapons. The tribe lived as nomads, moving from place to place rather than settling in one area. They were friendly toward Israel (</w:t>
       </w:r>
       <w:hyperlink r:id="rId44">
         <w:r>
@@ -5588,7 +5614,33 @@
         <w:rPr>
           <w:lang w:val="en_US" w:bidi="en_US"/>
         </w:rPr>
-        <w:t>The name "Kenite" is closely related to the word for "smith" (a metalworker who works with copper) in both Arabic and Aramaic. This suggests that this tribe might have been a group of traveling metalworkers who offered their skills wherever they were needed. Nomadic tribes of metalworkers were known to move throughout the ancient Near East from the early the 2nd millennium BC. Images of such workers can be found in the Beni-Hasan tomb in Egypt, which dates to the 19th century BC. Even in modern times, at least one Arab tribe of traveling smiths has followed trade routes looking for work.</w:t>
+        <w:t xml:space="preserve">The name </w:t>
+      </w:r>
+      <w:r>
+        <w:rPr>
+          <w:i/>
+          <w:lang w:val="en_US" w:bidi="en_US"/>
+        </w:rPr>
+        <w:t>Kenite</w:t>
+      </w:r>
+      <w:r>
+        <w:rPr>
+          <w:lang w:val="en_US" w:bidi="en_US"/>
+        </w:rPr>
+        <w:t xml:space="preserve"> is closely related to the word for </w:t>
+      </w:r>
+      <w:r>
+        <w:rPr>
+          <w:i/>
+          <w:lang w:val="en_US" w:bidi="en_US"/>
+        </w:rPr>
+        <w:t>smith</w:t>
+      </w:r>
+      <w:r>
+        <w:rPr>
+          <w:lang w:val="en_US" w:bidi="en_US"/>
+        </w:rPr>
+        <w:t xml:space="preserve"> (a metalworker who works with copper) in both Arabic and Aramaic. This suggests that this tribe might have been a group of traveling metalworkers who offered their skills wherever they were needed. Nomadic tribes of metalworkers were known to move throughout the ancient Near East from the early 2nd millennium BC. Images of such workers can be found in the Beni-Hasan tomb in Egypt, which dates to the 19th century BC. Even in modern times, at least one Arab tribe of traveling smiths has followed trade routes looking for work.</w:t>
       </w:r>
     </w:p>
     <w:p>
@@ -5645,7 +5697,7 @@
         <w:rPr>
           <w:lang w:val="en_US" w:bidi="en_US"/>
         </w:rPr>
-        <w:t>More significant is the suggestion that Jethro (also called Reuel), "priest of Midian," was the source of Moses's belief in one God—the monotheistic religion of Yahweh. This idea can be challenged from both biblical and historical perspectives.</w:t>
+        <w:t>More significant is the suggestion that Jethro (also called Reuel), the priest of Midian, influenced what Moses believed about one God—that is, the worship of Yahweh alone. This idea can be challenged on both biblical and historical grounds.</w:t>
       </w:r>
     </w:p>
     <w:p>
@@ -5683,13 +5735,26 @@
         <w:rPr>
           <w:lang w:val="en_US" w:bidi="en_US"/>
         </w:rPr>
-        <w:t>And to Seth also a son was born, and he called him Enosh. At that time men began to call upon the name of the LORD</w:t>
-      </w:r>
-      <w:r>
-        <w:rPr>
-          <w:lang w:val="en_US" w:bidi="en_US"/>
-        </w:rPr>
-        <w:t>." Equally important is the fact that Moses' mother (or ancestor, as some would suggest) had the name Jochebed, which means "Yahweh is glory." Clearly, Moses did not first hear about Yahweh from his father-in-law during his exile in the wilderness of Midian.</w:t>
+        <w:t>And to Seth also a son was born, and he called him Enosh. At that time, men began to call upon the name of the LORD</w:t>
+      </w:r>
+      <w:r>
+        <w:rPr>
+          <w:lang w:val="en_US" w:bidi="en_US"/>
+        </w:rPr>
+        <w:t xml:space="preserve">." Equally important is the fact that the mother of Moses (or ancestor, as some would suggest) had the name </w:t>
+      </w:r>
+      <w:r>
+        <w:rPr>
+          <w:i/>
+          <w:lang w:val="en_US" w:bidi="en_US"/>
+        </w:rPr>
+        <w:t>Jochebed</w:t>
+      </w:r>
+      <w:r>
+        <w:rPr>
+          <w:lang w:val="en_US" w:bidi="en_US"/>
+        </w:rPr>
+        <w:t>, which means "Yahweh is glory." Clearly, Moses did not first hear about Yahweh from his father-in-law during his exile in the wilderness of Midian.</w:t>
       </w:r>
     </w:p>
     <w:p>
@@ -6486,7 +6551,33 @@
         <w:rPr>
           <w:lang w:val="en_US" w:bidi="en_US"/>
         </w:rPr>
-        <w:t>Many scholars believe that the name Kerethite means "Cretan" (someone from the island of Crete). This makes sense because the Philistines may have come from Crete and other islands in the Mediterranean Sea. The word Pelethite is probably another way of saying "Philistine."</w:t>
+        <w:t xml:space="preserve">Many scholars believe that the name Kerethite means "Cretan" (someone from the island of Crete). This makes sense because the Philistines may have come from Crete and other islands in the Mediterranean Sea. The word </w:t>
+      </w:r>
+      <w:r>
+        <w:rPr>
+          <w:i/>
+          <w:lang w:val="en_US" w:bidi="en_US"/>
+        </w:rPr>
+        <w:t>Pelethite</w:t>
+      </w:r>
+      <w:r>
+        <w:rPr>
+          <w:lang w:val="en_US" w:bidi="en_US"/>
+        </w:rPr>
+        <w:t xml:space="preserve"> is probably another spelling of the word </w:t>
+      </w:r>
+      <w:r>
+        <w:rPr>
+          <w:i/>
+          <w:lang w:val="en_US" w:bidi="en_US"/>
+        </w:rPr>
+        <w:t>Philistine</w:t>
+      </w:r>
+      <w:r>
+        <w:rPr>
+          <w:lang w:val="en_US" w:bidi="en_US"/>
+        </w:rPr>
+        <w:t>.</w:t>
       </w:r>
     </w:p>
     <w:p>
@@ -7263,7 +7354,7 @@
         <w:rPr>
           <w:lang w:val="en_US" w:bidi="en_US"/>
         </w:rPr>
-        <w:t xml:space="preserve">The kerygma is essentially the same as the gospel. Although the term itself emphasizes the </w:t>
+        <w:t xml:space="preserve">The kerygma is essentially the same as the gospel (the good news about Jesus). Although the term itself emphasizes the </w:t>
       </w:r>
       <w:r>
         <w:rPr>
@@ -7497,7 +7588,7 @@
         <w:rPr>
           <w:lang w:val="en_US" w:bidi="en_US"/>
         </w:rPr>
-        <w:t>These topics are discussed elsewhere in the New Testament. However, they were not part of the basic message that Jesus's first followers shared. We know this because these topics are not found in the earliest Christian writings</w:t>
+        <w:t>These topics are discussed elsewhere in the New Testament. However, they were not part of the basic message that the first followers of Jesus shared. We know this because these topics are not found in the earliest Christian writings</w:t>
       </w:r>
     </w:p>
     <w:p>
@@ -9770,7 +9861,33 @@
         <w:rPr>
           <w:lang w:val="en_US" w:bidi="en_US"/>
         </w:rPr>
-        <w:t xml:space="preserve"> in the King James Version. A better translation would be "winter flow" or "winter course." This reflects the stream's seasonal nature, not a constant river.</w:t>
+        <w:t xml:space="preserve"> in the King James Version. A better translation would be </w:t>
+      </w:r>
+      <w:r>
+        <w:rPr>
+          <w:i/>
+          <w:lang w:val="en_US" w:bidi="en_US"/>
+        </w:rPr>
+        <w:t>winter flow</w:t>
+      </w:r>
+      <w:r>
+        <w:rPr>
+          <w:lang w:val="en_US" w:bidi="en_US"/>
+        </w:rPr>
+        <w:t xml:space="preserve"> or </w:t>
+      </w:r>
+      <w:r>
+        <w:rPr>
+          <w:i/>
+          <w:lang w:val="en_US" w:bidi="en_US"/>
+        </w:rPr>
+        <w:t>winter course</w:t>
+      </w:r>
+      <w:r>
+        <w:rPr>
+          <w:lang w:val="en_US" w:bidi="en_US"/>
+        </w:rPr>
+        <w:t>. This reflects the stream's seasonal nature, not a constant river.</w:t>
       </w:r>
     </w:p>
     <w:p>
@@ -9798,7 +9915,7 @@
         <w:rPr>
           <w:lang w:val="en_US" w:bidi="en_US"/>
         </w:rPr>
-        <w:t>Since the fourth century AD, the Kidron Valley has been called "the Valley of Jehoshaphat" (</w:t>
+        <w:t>Since the fourth century AD, the Kidron Valley has been called the Valley of Jehoshaphat (</w:t>
       </w:r>
       <w:hyperlink r:id="rId203">
         <w:r>
@@ -9983,7 +10100,7 @@
         <w:rPr>
           <w:lang w:val="en_US" w:bidi="en_US"/>
         </w:rPr>
-        <w:t>). The parallels between Jesus's and David's crossings are noteworthy. They relate to David's role in the biblical theme of kingship. Jeremiah prophesied that, in the end times, the Lord would make the Kidron Valley sacred (</w:t>
+        <w:t>). The similarities between the crossings of Jesus and the crossings of David are interesting, given his role in establishing the biblical symbolism of king and kingdom. Jeremiah prophesied that in the end times the Lord would make the Kidron Valley sacred (</w:t>
       </w:r>
       <w:hyperlink r:id="rId210">
         <w:r>

</xml_diff>

<commit_message>
Update AquiferOpenBibleDictionary data for 2026-07-27
</commit_message>
<xml_diff>
--- a/eng/docx/011.content.docx
+++ b/eng/docx/011.content.docx
@@ -9323,7 +9323,15 @@
         <w:rPr>
           <w:lang w:val="en_US" w:bidi="en_US"/>
         </w:rPr>
-        <w:t xml:space="preserve">Young goat. </w:t>
+        <w:t>A kid is a young goat.</w:t>
+      </w:r>
+    </w:p>
+    <w:p>
+      <w:pPr/>
+      <w:r>
+        <w:rPr>
+          <w:lang w:val="en_US" w:bidi="en_US"/>
+        </w:rPr>
       </w:r>
       <w:r>
         <w:rPr>
@@ -9342,7 +9350,7 @@
         <w:rPr>
           <w:lang w:val="en_US" w:bidi="en_US"/>
         </w:rPr>
-        <w:t>Animals (Goat)</w:t>
+        <w:t>Goat</w:t>
       </w:r>
       <w:r>
         <w:rPr>
@@ -28492,7 +28500,7 @@
         <w:rPr>
           <w:lang w:val="en_US" w:bidi="en_US"/>
         </w:rPr>
-        <w:t>People probably living northeast of Babylonia. They are named along with Babylon, Pekod, and Shoa as people who would come against Jerusalem as instruments of God’s judgment on Israel (</w:t>
+        <w:t>Koa was a people group that probably lived northeast of Babylonia. Koa is named with Babylon, Pekod, and Shoa as one of the peoples that would attack Jerusalem as instruments of God’s judgment on Israel (</w:t>
       </w:r>
       <w:hyperlink r:id="rId759">
         <w:r>
@@ -28503,14 +28511,14 @@
             <w:color w:val="0000EE"/>
             <w:u w:val="single"/>
           </w:rPr>
-          <w:t>Ez 23:23</w:t>
-        </w:r>
-      </w:hyperlink>
-      <w:r>
-        <w:rPr>
-          <w:lang w:val="en_US" w:bidi="en_US"/>
-        </w:rPr>
-        <w:t>). They are perhaps identifiable with the Kutu, mentioned frequently in Assyrian inscriptions.</w:t>
+          <w:t>Ezekiel 23:23</w:t>
+        </w:r>
+      </w:hyperlink>
+      <w:r>
+        <w:rPr>
+          <w:lang w:val="en_US" w:bidi="en_US"/>
+        </w:rPr>
+        <w:t>). They may be the Qutu, mentioned often in Assyrian inscriptions.</w:t>
       </w:r>
       <w:r>
         <w:rPr>

</xml_diff>